<commit_message>
Round-5 Seat 1 fixes: reviewer quotes restored verbatim, letter locations, supplement A.4, citations revisited; refreshed frozen round-5 build
Co-Authored-By: Claude Opus 5.5 <noreply@anthropic.com>
Claude-Session: https://claude.ai/code/session_01Ny4MKFPCnQG8RbtvfHQ86Z
</commit_message>
<xml_diff>
--- a/SAJE_292892_revision/build_r5/02_Manuscript_Revised_Marked_blue.docx
+++ b/SAJE_292892_revision/build_r5/02_Manuscript_Revised_Marked_blue.docx
@@ -861,7 +861,7 @@
         <w:rPr>
           <w:color w:val="0000FF"/>
         </w:rPr>
-        <w:t>Excluding the 135 firms scored in 2014, which have no pre-coverage year, leaves 3,288 firms with 32,521 listed firm-years (3,647 rows precede listing): 675 firms first scored between 2015 and 2024 (59.9% of them Malaysian) and 2,613 never-scored firms, which form the comparison group.</w:t>
+        <w:t>Excluding the 135 firms scored in 2014, which have no pre-coverage year, leaves 3,288 firms with 32,521 listed firm-years (3,647 rows precede listing): 675 firms first scored between 2015 and 2024 (59.9% of them Malaysian) and 2,613 never-scored firms, which form the comparison group; Tables S2 and S3 of the supplementary material give the firm-years and firms behind each estimate.</w:t>
       </w:r>
       <w:r>
         <w:rPr/>
@@ -9432,7 +9432,7 @@
                 <w:color w:val="0000FF"/>
                 <w:sz w:val="18"/>
               </w:rPr>
-              <w:t>(6) One year later, all firms (R10)</w:t>
+              <w:t>(6) One year later, all firms</w:t>
             </w:r>
           </w:p>
         </w:tc>
@@ -14507,7 +14507,7 @@
         <w:rPr>
           <w:color w:val="0000FF"/>
         </w:rPr>
-        <w:t>The provider may have added firms once they were large and visible enough to matter to its clients, or firms may have become scoreable by reporting, which mandatory disclosure rules make more likely (Krueger et al., 2024), by joining an index, or by issuing equity; the fall in leverage toward the base year fits equity issuance.</w:t>
+        <w:t>The provider may have added firms once they were large and visible enough to matter to its clients, consistent with its higher scores for larger firms (Dobrick et al., 2023; Drempetic et al., 2020), or firms may have become scoreable by reporting, which mandatory disclosure rules make more likely (Krueger et al., 2024), by joining an index, or by issuing equity; the fall in leverage toward the base year fits equity issuance.</w:t>
       </w:r>
       <w:r>
         <w:rPr/>
@@ -14570,7 +14570,7 @@
         <w:rPr>
           <w:color w:val="0000FF"/>
         </w:rPr>
-        <w:t>ESG fund holdings respond to MSCI ratings, not to those of other providers (Berg, Heeb, et al., 2022); ratings that investors see directly, such as Morningstar's fund sustainability ratings, redirect flows (Hartzmark &amp; Sussman, 2019); and because providers disagree about the same firm and the disagreement is priced (Avramov et al., 2022; Christensen et al., 2022; Gibson Brandon et al., 2021), entry into one provider's coverage need not change how investors who rely on other ratings value a firm.</w:t>
+        <w:t>ESG fund holdings respond to MSCI ratings, not to those of other providers (Berg, Heeb, et al., 2022); ratings that investors see directly, such as Morningstar's fund sustainability ratings, redirect flows (Hartzmark &amp; Sussman, 2019); and because providers disagree about the same firm and the disagreement is priced (Avramov et al., 2022; Berg, Kölbel, et al., 2022; Christensen et al., 2022; Gibson Brandon et al., 2021), entry into one provider's coverage need not change how investors who rely on other ratings value a firm.</w:t>
       </w:r>
       <w:r>
         <w:rPr/>
@@ -14590,7 +14590,7 @@
         <w:rPr>
           <w:color w:val="0000FF"/>
         </w:rPr>
-        <w:t>Unlike U.S. evidence that coverage changes firm conduct and payout (Bikmetova &amp; Pirinsky, 2026; Tsang et al., 2024, 2025), we find no change in leverage and a total-assets increase that loses significance after Holm adjustment.</w:t>
+        <w:t>Unlike U.S. evidence that coverage changes firm conduct and payout (Bikmetova &amp; Pirinsky, 2026; Tsang et al., 2024, 2025), we find no detected change in leverage (0.8 percentage points, Holm p = 0.134) and a total-assets increase that loses significance after Holm adjustment.</w:t>
       </w:r>
       <w:r>
         <w:rPr/>
@@ -14643,7 +14643,7 @@
         <w:rPr>
           <w:color w:val="0000FF"/>
         </w:rPr>
-        <w:t>For exchanges and regulators, broad expansions such as the Malaysian wave appear to select less on prior growth, and we detect no MTB gain within them (95% interval −0.053 to 0.091); arguments for expanding coverage should therefore rest on grounds other than an expected rise in issuer valuations.</w:t>
+        <w:t>For exchanges and regulators, broad expansions such as the Malaysian wave appear to select less on prior growth, and we detect no MTB gain within them, although the interval (−0.053 to 0.091) admits gains larger than the pooled upper bound; arguments for expanding coverage should therefore rest on grounds other than an expected rise in issuer valuations.</w:t>
       </w:r>
     </w:p>
     <w:p>

</xml_diff>